<commit_message>
feat: save dataset cleaned
</commit_message>
<xml_diff>
--- a/Assignment2/2311103078_REG02_Tugas 2 Visualisasi Data.docx
+++ b/Assignment2/2311103078_REG02_Tugas 2 Visualisasi Data.docx
@@ -495,6 +495,86 @@
     <w:p>
       <w:pPr>
         <w:spacing w:line="360" w:lineRule="auto"/>
+        <w:rPr>
+          <w:b/>
+          <w:bCs/>
+          <w:sz w:val="24"/>
+          <w:szCs w:val="24"/>
+        </w:rPr>
+      </w:pPr>
+      <w:r>
+        <w:rPr>
+          <w:b/>
+          <w:bCs/>
+          <w:sz w:val="24"/>
+          <w:szCs w:val="24"/>
+        </w:rPr>
+        <w:lastRenderedPageBreak/>
+        <w:t xml:space="preserve">Link </w:t>
+      </w:r>
+      <w:proofErr w:type="spellStart"/>
+      <w:r>
+        <w:rPr>
+          <w:b/>
+          <w:bCs/>
+          <w:sz w:val="24"/>
+          <w:szCs w:val="24"/>
+        </w:rPr>
+        <w:t>Colab</w:t>
+      </w:r>
+      <w:proofErr w:type="spellEnd"/>
+      <w:r>
+        <w:rPr>
+          <w:b/>
+          <w:bCs/>
+          <w:sz w:val="24"/>
+          <w:szCs w:val="24"/>
+        </w:rPr>
+        <w:t>:</w:t>
+      </w:r>
+      <w:r>
+        <w:rPr>
+          <w:b/>
+          <w:bCs/>
+          <w:sz w:val="24"/>
+          <w:szCs w:val="24"/>
+        </w:rPr>
+        <w:t xml:space="preserve"> </w:t>
+      </w:r>
+      <w:hyperlink r:id="rId6" w:history="1">
+        <w:r>
+          <w:rPr>
+            <w:rStyle w:val="Hyperlink"/>
+            <w:sz w:val="24"/>
+            <w:szCs w:val="24"/>
+          </w:rPr>
+          <w:t>https://colab.research.google.com/drive/1qMHnaj8vXesJcwyZKuWBRtQF9WysU0ec?usp=sharing</w:t>
+        </w:r>
+      </w:hyperlink>
+      <w:r>
+        <w:rPr>
+          <w:b/>
+          <w:bCs/>
+          <w:sz w:val="24"/>
+          <w:szCs w:val="24"/>
+        </w:rPr>
+        <w:t xml:space="preserve"> </w:t>
+      </w:r>
+    </w:p>
+    <w:p>
+      <w:pPr>
+        <w:spacing w:line="360" w:lineRule="auto"/>
+        <w:rPr>
+          <w:b/>
+          <w:bCs/>
+          <w:sz w:val="24"/>
+          <w:szCs w:val="24"/>
+        </w:rPr>
+      </w:pPr>
+    </w:p>
+    <w:p>
+      <w:pPr>
+        <w:spacing w:line="360" w:lineRule="auto"/>
         <w:ind w:firstLine="720"/>
         <w:rPr>
           <w:sz w:val="24"/>
@@ -507,7 +587,6 @@
           <w:sz w:val="24"/>
           <w:szCs w:val="24"/>
         </w:rPr>
-        <w:lastRenderedPageBreak/>
         <w:t>Berikut</w:t>
       </w:r>
       <w:proofErr w:type="spellEnd"/>
@@ -2364,7 +2443,15 @@
                 <w:sz w:val="20"/>
                 <w:szCs w:val="20"/>
               </w:rPr>
-              <w:t>drop_duplicates</w:t>
+              <w:t>drop_</w:t>
+            </w:r>
+            <w:proofErr w:type="gramStart"/>
+            <w:r>
+              <w:rPr>
+                <w:sz w:val="20"/>
+                <w:szCs w:val="20"/>
+              </w:rPr>
+              <w:t>duplicates</w:t>
             </w:r>
             <w:proofErr w:type="spellEnd"/>
             <w:r>
@@ -2372,7 +2459,15 @@
                 <w:sz w:val="20"/>
                 <w:szCs w:val="20"/>
               </w:rPr>
-              <w:t>().</w:t>
+              <w:t>(</w:t>
+            </w:r>
+            <w:proofErr w:type="gramEnd"/>
+            <w:r>
+              <w:rPr>
+                <w:sz w:val="20"/>
+                <w:szCs w:val="20"/>
+              </w:rPr>
+              <w:t>).</w:t>
             </w:r>
           </w:p>
         </w:tc>
@@ -3031,6 +3126,7 @@
               <w:t xml:space="preserve"> mapping dan </w:t>
             </w:r>
             <w:proofErr w:type="spellStart"/>
+            <w:proofErr w:type="gramStart"/>
             <w:r>
               <w:rPr>
                 <w:sz w:val="20"/>
@@ -3044,7 +3140,15 @@
                 <w:sz w:val="20"/>
                 <w:szCs w:val="20"/>
               </w:rPr>
-              <w:t xml:space="preserve"> .title().</w:t>
+              <w:t xml:space="preserve"> .title</w:t>
+            </w:r>
+            <w:proofErr w:type="gramEnd"/>
+            <w:r>
+              <w:rPr>
+                <w:sz w:val="20"/>
+                <w:szCs w:val="20"/>
+              </w:rPr>
+              <w:t>().</w:t>
             </w:r>
           </w:p>
         </w:tc>
@@ -3556,7 +3660,7 @@
                     <pic:cNvPicPr/>
                   </pic:nvPicPr>
                   <pic:blipFill>
-                    <a:blip r:embed="rId6"/>
+                    <a:blip r:embed="rId7"/>
                     <a:stretch>
                       <a:fillRect/>
                     </a:stretch>
@@ -3715,6 +3819,7 @@
           <w:sz w:val="24"/>
           <w:szCs w:val="24"/>
         </w:rPr>
+        <w:lastRenderedPageBreak/>
         <w:t>Berdasarkan</w:t>
       </w:r>
       <w:proofErr w:type="spellEnd"/>
@@ -4155,15 +4260,7 @@
           <w:sz w:val="24"/>
           <w:szCs w:val="24"/>
         </w:rPr>
-        <w:t xml:space="preserve"> </w:t>
-      </w:r>
-      <w:r>
-        <w:rPr>
-          <w:sz w:val="24"/>
-          <w:szCs w:val="24"/>
-        </w:rPr>
-        <w:lastRenderedPageBreak/>
-        <w:t xml:space="preserve">(Profit) </w:t>
+        <w:t xml:space="preserve"> (Profit) </w:t>
       </w:r>
       <w:proofErr w:type="spellStart"/>
       <w:r>
@@ -4693,6 +4790,7 @@
         </w:rPr>
         <w:t xml:space="preserve"> </w:t>
       </w:r>
+      <w:proofErr w:type="gramStart"/>
       <w:r>
         <w:rPr>
           <w:b/>
@@ -4707,7 +4805,15 @@
           <w:sz w:val="24"/>
           <w:szCs w:val="24"/>
         </w:rPr>
-        <w:t xml:space="preserve"> unit </w:t>
+        <w:t xml:space="preserve"> unit</w:t>
+      </w:r>
+      <w:proofErr w:type="gramEnd"/>
+      <w:r>
+        <w:rPr>
+          <w:sz w:val="24"/>
+          <w:szCs w:val="24"/>
+        </w:rPr>
+        <w:t xml:space="preserve"> </w:t>
       </w:r>
       <w:proofErr w:type="spellStart"/>
       <w:r>
@@ -5085,7 +5191,7 @@
                     <pic:cNvPicPr/>
                   </pic:nvPicPr>
                   <pic:blipFill>
-                    <a:blip r:embed="rId7"/>
+                    <a:blip r:embed="rId8"/>
                     <a:stretch>
                       <a:fillRect/>
                     </a:stretch>
@@ -5267,7 +5373,7 @@
                     <pic:cNvPicPr/>
                   </pic:nvPicPr>
                   <pic:blipFill>
-                    <a:blip r:embed="rId8"/>
+                    <a:blip r:embed="rId9"/>
                     <a:stretch>
                       <a:fillRect/>
                     </a:stretch>
@@ -5437,6 +5543,7 @@
           <w:sz w:val="24"/>
           <w:szCs w:val="24"/>
         </w:rPr>
+        <w:lastRenderedPageBreak/>
         <w:t>Visualisasi</w:t>
       </w:r>
       <w:proofErr w:type="spellEnd"/>
@@ -5757,7 +5864,6 @@
           <w:sz w:val="24"/>
           <w:szCs w:val="24"/>
         </w:rPr>
-        <w:lastRenderedPageBreak/>
         <w:t>perubahan</w:t>
       </w:r>
       <w:proofErr w:type="spellEnd"/>
@@ -8270,6 +8376,92 @@
     </w:lvl>
   </w:abstractNum>
   <w:abstractNum w:abstractNumId="2" w15:restartNumberingAfterBreak="0">
+    <w:nsid w:val="21352F5D"/>
+    <w:multiLevelType w:val="hybridMultilevel"/>
+    <w:tmpl w:val="5E60E23E"/>
+    <w:lvl w:ilvl="0" w:tplc="3809000F">
+      <w:start w:val="1"/>
+      <w:numFmt w:val="decimal"/>
+      <w:lvlText w:val="%1."/>
+      <w:lvlJc w:val="left"/>
+      <w:pPr>
+        <w:ind w:left="720" w:hanging="360"/>
+      </w:pPr>
+    </w:lvl>
+    <w:lvl w:ilvl="1" w:tplc="38090019" w:tentative="1">
+      <w:start w:val="1"/>
+      <w:numFmt w:val="lowerLetter"/>
+      <w:lvlText w:val="%2."/>
+      <w:lvlJc w:val="left"/>
+      <w:pPr>
+        <w:ind w:left="1440" w:hanging="360"/>
+      </w:pPr>
+    </w:lvl>
+    <w:lvl w:ilvl="2" w:tplc="3809001B" w:tentative="1">
+      <w:start w:val="1"/>
+      <w:numFmt w:val="lowerRoman"/>
+      <w:lvlText w:val="%3."/>
+      <w:lvlJc w:val="right"/>
+      <w:pPr>
+        <w:ind w:left="2160" w:hanging="180"/>
+      </w:pPr>
+    </w:lvl>
+    <w:lvl w:ilvl="3" w:tplc="3809000F" w:tentative="1">
+      <w:start w:val="1"/>
+      <w:numFmt w:val="decimal"/>
+      <w:lvlText w:val="%4."/>
+      <w:lvlJc w:val="left"/>
+      <w:pPr>
+        <w:ind w:left="2880" w:hanging="360"/>
+      </w:pPr>
+    </w:lvl>
+    <w:lvl w:ilvl="4" w:tplc="38090019" w:tentative="1">
+      <w:start w:val="1"/>
+      <w:numFmt w:val="lowerLetter"/>
+      <w:lvlText w:val="%5."/>
+      <w:lvlJc w:val="left"/>
+      <w:pPr>
+        <w:ind w:left="3600" w:hanging="360"/>
+      </w:pPr>
+    </w:lvl>
+    <w:lvl w:ilvl="5" w:tplc="3809001B" w:tentative="1">
+      <w:start w:val="1"/>
+      <w:numFmt w:val="lowerRoman"/>
+      <w:lvlText w:val="%6."/>
+      <w:lvlJc w:val="right"/>
+      <w:pPr>
+        <w:ind w:left="4320" w:hanging="180"/>
+      </w:pPr>
+    </w:lvl>
+    <w:lvl w:ilvl="6" w:tplc="3809000F" w:tentative="1">
+      <w:start w:val="1"/>
+      <w:numFmt w:val="decimal"/>
+      <w:lvlText w:val="%7."/>
+      <w:lvlJc w:val="left"/>
+      <w:pPr>
+        <w:ind w:left="5040" w:hanging="360"/>
+      </w:pPr>
+    </w:lvl>
+    <w:lvl w:ilvl="7" w:tplc="38090019" w:tentative="1">
+      <w:start w:val="1"/>
+      <w:numFmt w:val="lowerLetter"/>
+      <w:lvlText w:val="%8."/>
+      <w:lvlJc w:val="left"/>
+      <w:pPr>
+        <w:ind w:left="5760" w:hanging="360"/>
+      </w:pPr>
+    </w:lvl>
+    <w:lvl w:ilvl="8" w:tplc="3809001B" w:tentative="1">
+      <w:start w:val="1"/>
+      <w:numFmt w:val="lowerRoman"/>
+      <w:lvlText w:val="%9."/>
+      <w:lvlJc w:val="right"/>
+      <w:pPr>
+        <w:ind w:left="6480" w:hanging="180"/>
+      </w:pPr>
+    </w:lvl>
+  </w:abstractNum>
+  <w:abstractNum w:abstractNumId="3" w15:restartNumberingAfterBreak="0">
     <w:nsid w:val="2D4857F8"/>
     <w:multiLevelType w:val="hybridMultilevel"/>
     <w:tmpl w:val="05C00EEA"/>
@@ -8355,7 +8547,7 @@
       </w:pPr>
     </w:lvl>
   </w:abstractNum>
-  <w:abstractNum w:abstractNumId="3" w15:restartNumberingAfterBreak="0">
+  <w:abstractNum w:abstractNumId="4" w15:restartNumberingAfterBreak="0">
     <w:nsid w:val="469F0CE7"/>
     <w:multiLevelType w:val="hybridMultilevel"/>
     <w:tmpl w:val="3E86E784"/>
@@ -8441,7 +8633,7 @@
       </w:pPr>
     </w:lvl>
   </w:abstractNum>
-  <w:abstractNum w:abstractNumId="4" w15:restartNumberingAfterBreak="0">
+  <w:abstractNum w:abstractNumId="5" w15:restartNumberingAfterBreak="0">
     <w:nsid w:val="74C02938"/>
     <w:multiLevelType w:val="hybridMultilevel"/>
     <w:tmpl w:val="D4B019E2"/>
@@ -8540,13 +8732,16 @@
     </w:lvlOverride>
   </w:num>
   <w:num w:numId="3" w16cid:durableId="508838542">
+    <w:abstractNumId w:val="5"/>
+  </w:num>
+  <w:num w:numId="4" w16cid:durableId="1134835566">
+    <w:abstractNumId w:val="3"/>
+  </w:num>
+  <w:num w:numId="5" w16cid:durableId="1270157601">
     <w:abstractNumId w:val="4"/>
   </w:num>
-  <w:num w:numId="4" w16cid:durableId="1134835566">
+  <w:num w:numId="6" w16cid:durableId="1100837415">
     <w:abstractNumId w:val="2"/>
-  </w:num>
-  <w:num w:numId="5" w16cid:durableId="1270157601">
-    <w:abstractNumId w:val="3"/>
   </w:num>
 </w:numbering>
 </file>
@@ -9194,6 +9389,18 @@
       <w:szCs w:val="18"/>
     </w:rPr>
   </w:style>
+  <w:style w:type="character" w:styleId="UnresolvedMention">
+    <w:name w:val="Unresolved Mention"/>
+    <w:basedOn w:val="DefaultParagraphFont"/>
+    <w:uiPriority w:val="99"/>
+    <w:semiHidden/>
+    <w:unhideWhenUsed/>
+    <w:rsid w:val="009102D5"/>
+    <w:rPr>
+      <w:color w:val="605E5C"/>
+      <w:shd w:val="clear" w:color="auto" w:fill="E1DFDD"/>
+    </w:rPr>
+  </w:style>
 </w:styles>
 </file>
 

</xml_diff>